<commit_message>
Actualizacion completa Unidad 2 y script inventario.py
</commit_message>
<xml_diff>
--- a/documentos/Practica_29_Sep_AmadorEspinoza.docx
+++ b/documentos/Practica_29_Sep_AmadorEspinoza.docx
@@ -296,6 +296,557 @@
       </w:r>
     </w:p>
     <w:p/>
+    <w:p>
+      <w:r>
+        <w:t>Parte 1: Análisis de Inventario</w:t>
+      </w:r>
+    </w:p>
+    <w:p>
+      <w:r>
+        <w:t>Imagina que estás automatizando la auditoría de una red empresarial. Has recibido el siguiente</w:t>
+      </w:r>
+    </w:p>
+    <w:p>
+      <w:r>
+        <w:t>objeto JSON que representa el inventario actual de dispositivos. Tu objetivo es identificar qué</w:t>
+      </w:r>
+    </w:p>
+    <w:p>
+      <w:r>
+        <w:t xml:space="preserve">equipos están fuera de línea </w:t>
+      </w:r>
+      <w:proofErr w:type="gramStart"/>
+      <w:r>
+        <w:t xml:space="preserve">( </w:t>
+      </w:r>
+      <w:proofErr w:type="spellStart"/>
+      <w:r>
+        <w:t>down</w:t>
+      </w:r>
+      <w:proofErr w:type="spellEnd"/>
+      <w:proofErr w:type="gramEnd"/>
+      <w:r>
+        <w:t xml:space="preserve"> ) para generar un reporte de incidentes.</w:t>
+      </w:r>
+    </w:p>
+    <w:p>
+      <w:pPr>
+        <w:rPr>
+          <w:lang w:val="pt-PT"/>
+        </w:rPr>
+      </w:pPr>
+      <w:r>
+        <w:rPr>
+          <w:lang w:val="pt-PT"/>
+        </w:rPr>
+        <w:t>[</w:t>
+      </w:r>
+    </w:p>
+    <w:p>
+      <w:pPr>
+        <w:rPr>
+          <w:lang w:val="pt-PT"/>
+        </w:rPr>
+      </w:pPr>
+      <w:r>
+        <w:rPr>
+          <w:lang w:val="pt-PT"/>
+        </w:rPr>
+        <w:t>{"hostname": "Core-SW01", "ip": "10.0.0.1", "status": "up"},</w:t>
+      </w:r>
+    </w:p>
+    <w:p>
+      <w:pPr>
+        <w:rPr>
+          <w:lang w:val="pt-PT"/>
+        </w:rPr>
+      </w:pPr>
+      <w:r>
+        <w:rPr>
+          <w:lang w:val="pt-PT"/>
+        </w:rPr>
+        <w:t>{"hostname": "Dist-SW02", "ip": "10.0.0.2", "status": "down"},</w:t>
+      </w:r>
+    </w:p>
+    <w:p>
+      <w:pPr>
+        <w:rPr>
+          <w:lang w:val="pt-PT"/>
+        </w:rPr>
+      </w:pPr>
+      <w:r>
+        <w:rPr>
+          <w:lang w:val="pt-PT"/>
+        </w:rPr>
+        <w:t>{"hostname": "Access-SW03", "ip": "10.0.0.3", "status": "up"},</w:t>
+      </w:r>
+    </w:p>
+    <w:p>
+      <w:pPr>
+        <w:rPr>
+          <w:lang w:val="pt-PT"/>
+        </w:rPr>
+      </w:pPr>
+      <w:r>
+        <w:rPr>
+          <w:lang w:val="pt-PT"/>
+        </w:rPr>
+        <w:t>{"hostname": "Edge-R01", "ip": "172.16.1.1", "status": "down"}</w:t>
+      </w:r>
+    </w:p>
+    <w:p>
+      <w:r>
+        <w:t>]</w:t>
+      </w:r>
+    </w:p>
+    <w:p>
+      <w:r>
+        <w:t>1. Escribe el pseudocódigo o completa el script de Python necesario para procesar la variable</w:t>
+      </w:r>
+    </w:p>
+    <w:p>
+      <w:proofErr w:type="spellStart"/>
+      <w:r>
+        <w:t>inventario_json</w:t>
+      </w:r>
+      <w:proofErr w:type="spellEnd"/>
+      <w:r>
+        <w:t xml:space="preserve"> (que contiene el texto anterior). El script debe filtrar e imprimir únicamente los</w:t>
+      </w:r>
+    </w:p>
+    <w:p>
+      <w:r>
+        <w:drawing>
+          <wp:anchor distT="0" distB="0" distL="114300" distR="114300" simplePos="0" relativeHeight="251658240" behindDoc="1" locked="0" layoutInCell="1" allowOverlap="1" wp14:anchorId="4218FAC5" wp14:editId="7DE6AB7D">
+            <wp:simplePos x="0" y="0"/>
+            <wp:positionH relativeFrom="column">
+              <wp:posOffset>947201</wp:posOffset>
+            </wp:positionH>
+            <wp:positionV relativeFrom="paragraph">
+              <wp:posOffset>386365</wp:posOffset>
+            </wp:positionV>
+            <wp:extent cx="3843020" cy="1872615"/>
+            <wp:effectExtent l="0" t="0" r="5080" b="0"/>
+            <wp:wrapThrough wrapText="bothSides">
+              <wp:wrapPolygon edited="0">
+                <wp:start x="0" y="0"/>
+                <wp:lineTo x="0" y="21314"/>
+                <wp:lineTo x="21521" y="21314"/>
+                <wp:lineTo x="21521" y="0"/>
+                <wp:lineTo x="0" y="0"/>
+              </wp:wrapPolygon>
+            </wp:wrapThrough>
+            <wp:docPr id="1897472735" name="Imagen 1"/>
+            <wp:cNvGraphicFramePr>
+              <a:graphicFrameLocks xmlns:a="http://schemas.openxmlformats.org/drawingml/2006/main" noChangeAspect="1"/>
+            </wp:cNvGraphicFramePr>
+            <a:graphic xmlns:a="http://schemas.openxmlformats.org/drawingml/2006/main">
+              <a:graphicData uri="http://schemas.openxmlformats.org/drawingml/2006/picture">
+                <pic:pic xmlns:pic="http://schemas.openxmlformats.org/drawingml/2006/picture">
+                  <pic:nvPicPr>
+                    <pic:cNvPr id="1897472735" name=""/>
+                    <pic:cNvPicPr/>
+                  </pic:nvPicPr>
+                  <pic:blipFill>
+                    <a:blip r:embed="rId5" cstate="print">
+                      <a:extLst>
+                        <a:ext uri="{28A0092B-C50C-407E-A947-70E740481C1C}">
+                          <a14:useLocalDpi xmlns:a14="http://schemas.microsoft.com/office/drawing/2010/main" val="0"/>
+                        </a:ext>
+                      </a:extLst>
+                    </a:blip>
+                    <a:stretch>
+                      <a:fillRect/>
+                    </a:stretch>
+                  </pic:blipFill>
+                  <pic:spPr>
+                    <a:xfrm>
+                      <a:off x="0" y="0"/>
+                      <a:ext cx="3843020" cy="1872615"/>
+                    </a:xfrm>
+                    <a:prstGeom prst="rect">
+                      <a:avLst/>
+                    </a:prstGeom>
+                  </pic:spPr>
+                </pic:pic>
+              </a:graphicData>
+            </a:graphic>
+          </wp:anchor>
+        </w:drawing>
+      </w:r>
+      <w:proofErr w:type="spellStart"/>
+      <w:r>
+        <w:t>hostnames</w:t>
+      </w:r>
+      <w:proofErr w:type="spellEnd"/>
+      <w:r>
+        <w:t xml:space="preserve"> de los dispositivos cuyo estado sea '</w:t>
+      </w:r>
+      <w:proofErr w:type="spellStart"/>
+      <w:r>
+        <w:t>down</w:t>
+      </w:r>
+      <w:proofErr w:type="spellEnd"/>
+      <w:r>
+        <w:t>’.</w:t>
+      </w:r>
+    </w:p>
+    <w:p/>
+    <w:p/>
+    <w:p/>
+    <w:p/>
+    <w:p/>
+    <w:p/>
+    <w:p/>
+    <w:p>
+      <w:r>
+        <w:t xml:space="preserve">Parte 2: Comparativa de Formatos (JSON vs. XML) En redes modernas, REST </w:t>
+      </w:r>
+      <w:proofErr w:type="spellStart"/>
+      <w:r>
+        <w:t>APIs</w:t>
+      </w:r>
+      <w:proofErr w:type="spellEnd"/>
+      <w:r>
+        <w:t xml:space="preserve"> suelen preferir JSON por ser más ligero, pero muchos sistemas heredados o protocolos como NETCONF utilizan XML. Observa cómo se estructuran los mismos datos en ambos formatos.</w:t>
+      </w:r>
+    </w:p>
+    <w:p>
+      <w:pPr>
+        <w:rPr>
+          <w:b/>
+          <w:bCs/>
+        </w:rPr>
+      </w:pPr>
+      <w:r>
+        <w:rPr>
+          <w:b/>
+          <w:bCs/>
+        </w:rPr>
+        <w:t>Diferencias Principales</w:t>
+      </w:r>
+    </w:p>
+    <w:p>
+      <w:pPr>
+        <w:numPr>
+          <w:ilvl w:val="0"/>
+          <w:numId w:val="2"/>
+        </w:numPr>
+      </w:pPr>
+      <w:r>
+        <w:rPr>
+          <w:b/>
+          <w:bCs/>
+        </w:rPr>
+        <w:t xml:space="preserve">JSON (JavaScript </w:t>
+      </w:r>
+      <w:proofErr w:type="spellStart"/>
+      <w:r>
+        <w:rPr>
+          <w:b/>
+          <w:bCs/>
+        </w:rPr>
+        <w:t>Object</w:t>
+      </w:r>
+      <w:proofErr w:type="spellEnd"/>
+      <w:r>
+        <w:rPr>
+          <w:b/>
+          <w:bCs/>
+        </w:rPr>
+        <w:t xml:space="preserve"> </w:t>
+      </w:r>
+      <w:proofErr w:type="spellStart"/>
+      <w:r>
+        <w:rPr>
+          <w:b/>
+          <w:bCs/>
+        </w:rPr>
+        <w:t>Notation</w:t>
+      </w:r>
+      <w:proofErr w:type="spellEnd"/>
+      <w:r>
+        <w:rPr>
+          <w:b/>
+          <w:bCs/>
+        </w:rPr>
+        <w:t>):</w:t>
+      </w:r>
+    </w:p>
+    <w:p>
+      <w:pPr>
+        <w:numPr>
+          <w:ilvl w:val="1"/>
+          <w:numId w:val="2"/>
+        </w:numPr>
+      </w:pPr>
+      <w:r>
+        <w:t xml:space="preserve">Usa una estructura de </w:t>
+      </w:r>
+      <w:r>
+        <w:rPr>
+          <w:b/>
+          <w:bCs/>
+        </w:rPr>
+        <w:t>pares clave-valor</w:t>
+      </w:r>
+      <w:r>
+        <w:t xml:space="preserve"> mediante llaves {} y comillas "". </w:t>
+      </w:r>
+    </w:p>
+    <w:p>
+      <w:pPr>
+        <w:numPr>
+          <w:ilvl w:val="1"/>
+          <w:numId w:val="2"/>
+        </w:numPr>
+      </w:pPr>
+      <w:r>
+        <w:t xml:space="preserve">Es mucho más </w:t>
+      </w:r>
+      <w:r>
+        <w:rPr>
+          <w:b/>
+          <w:bCs/>
+        </w:rPr>
+        <w:t>ligero y fácil de leer</w:t>
+      </w:r>
+      <w:r>
+        <w:t xml:space="preserve"> tanto para humanos como para scripts de Python. </w:t>
+      </w:r>
+    </w:p>
+    <w:p>
+      <w:pPr>
+        <w:numPr>
+          <w:ilvl w:val="1"/>
+          <w:numId w:val="2"/>
+        </w:numPr>
+      </w:pPr>
+      <w:r>
+        <w:t xml:space="preserve">Se utiliza principalmente en </w:t>
+      </w:r>
+      <w:r>
+        <w:rPr>
+          <w:b/>
+          <w:bCs/>
+        </w:rPr>
+        <w:t xml:space="preserve">REST </w:t>
+      </w:r>
+      <w:proofErr w:type="spellStart"/>
+      <w:r>
+        <w:rPr>
+          <w:b/>
+          <w:bCs/>
+        </w:rPr>
+        <w:t>APIs</w:t>
+      </w:r>
+      <w:proofErr w:type="spellEnd"/>
+      <w:r>
+        <w:t xml:space="preserve"> modernas. </w:t>
+      </w:r>
+    </w:p>
+    <w:p>
+      <w:pPr>
+        <w:numPr>
+          <w:ilvl w:val="0"/>
+          <w:numId w:val="2"/>
+        </w:numPr>
+      </w:pPr>
+      <w:r>
+        <w:rPr>
+          <w:b/>
+          <w:bCs/>
+        </w:rPr>
+        <w:t>XML (</w:t>
+      </w:r>
+      <w:proofErr w:type="spellStart"/>
+      <w:r>
+        <w:rPr>
+          <w:b/>
+          <w:bCs/>
+        </w:rPr>
+        <w:t>eXtensible</w:t>
+      </w:r>
+      <w:proofErr w:type="spellEnd"/>
+      <w:r>
+        <w:rPr>
+          <w:b/>
+          <w:bCs/>
+        </w:rPr>
+        <w:t xml:space="preserve"> </w:t>
+      </w:r>
+      <w:proofErr w:type="spellStart"/>
+      <w:r>
+        <w:rPr>
+          <w:b/>
+          <w:bCs/>
+        </w:rPr>
+        <w:t>Markup</w:t>
+      </w:r>
+      <w:proofErr w:type="spellEnd"/>
+      <w:r>
+        <w:rPr>
+          <w:b/>
+          <w:bCs/>
+        </w:rPr>
+        <w:t xml:space="preserve"> </w:t>
+      </w:r>
+      <w:proofErr w:type="spellStart"/>
+      <w:r>
+        <w:rPr>
+          <w:b/>
+          <w:bCs/>
+        </w:rPr>
+        <w:t>Language</w:t>
+      </w:r>
+      <w:proofErr w:type="spellEnd"/>
+      <w:r>
+        <w:rPr>
+          <w:b/>
+          <w:bCs/>
+        </w:rPr>
+        <w:t>):</w:t>
+      </w:r>
+    </w:p>
+    <w:p>
+      <w:pPr>
+        <w:numPr>
+          <w:ilvl w:val="1"/>
+          <w:numId w:val="2"/>
+        </w:numPr>
+      </w:pPr>
+      <w:r>
+        <w:t xml:space="preserve">Usa una estructura basada en </w:t>
+      </w:r>
+      <w:r>
+        <w:rPr>
+          <w:b/>
+          <w:bCs/>
+        </w:rPr>
+        <w:t>etiquetas de apertura y cierre</w:t>
+      </w:r>
+      <w:r>
+        <w:t xml:space="preserve"> (como &lt;</w:t>
+      </w:r>
+      <w:proofErr w:type="spellStart"/>
+      <w:r>
+        <w:t>device</w:t>
+      </w:r>
+      <w:proofErr w:type="spellEnd"/>
+      <w:r>
+        <w:t>&gt; y &lt;/</w:t>
+      </w:r>
+      <w:proofErr w:type="spellStart"/>
+      <w:r>
+        <w:t>device</w:t>
+      </w:r>
+      <w:proofErr w:type="spellEnd"/>
+      <w:r>
+        <w:t xml:space="preserve">&gt;). </w:t>
+      </w:r>
+    </w:p>
+    <w:p>
+      <w:pPr>
+        <w:numPr>
+          <w:ilvl w:val="1"/>
+          <w:numId w:val="2"/>
+        </w:numPr>
+      </w:pPr>
+      <w:r>
+        <w:t xml:space="preserve">Es más </w:t>
+      </w:r>
+      <w:r>
+        <w:rPr>
+          <w:b/>
+          <w:bCs/>
+        </w:rPr>
+        <w:t>pesado y con más sobrecarga de texto</w:t>
+      </w:r>
+      <w:r>
+        <w:t xml:space="preserve"> debido a la repetición de las etiquetas. </w:t>
+      </w:r>
+    </w:p>
+    <w:p>
+      <w:pPr>
+        <w:numPr>
+          <w:ilvl w:val="1"/>
+          <w:numId w:val="2"/>
+        </w:numPr>
+      </w:pPr>
+      <w:r>
+        <w:t xml:space="preserve">Se utiliza en protocolos tradicionales o de automatización como </w:t>
+      </w:r>
+      <w:r>
+        <w:rPr>
+          <w:b/>
+          <w:bCs/>
+        </w:rPr>
+        <w:t>NETCONF</w:t>
+      </w:r>
+      <w:r>
+        <w:t xml:space="preserve">. </w:t>
+      </w:r>
+    </w:p>
+    <w:p>
+      <w:pPr>
+        <w:rPr>
+          <w:b/>
+          <w:bCs/>
+        </w:rPr>
+      </w:pPr>
+      <w:r>
+        <w:rPr>
+          <w:b/>
+          <w:bCs/>
+        </w:rPr>
+        <w:t>Preguntas / Respuestas Tipo Examen</w:t>
+      </w:r>
+    </w:p>
+    <w:p>
+      <w:r>
+        <w:t>Si la actividad te pide explicar las diferencias o responder sobre la comparativa, puedes poner lo siguiente:</w:t>
+      </w:r>
+    </w:p>
+    <w:p>
+      <w:pPr>
+        <w:numPr>
+          <w:ilvl w:val="0"/>
+          <w:numId w:val="3"/>
+        </w:numPr>
+      </w:pPr>
+      <w:r>
+        <w:rPr>
+          <w:b/>
+          <w:bCs/>
+        </w:rPr>
+        <w:t>¿Cuál es la ventaja de JSON sobre XML en la automatización de redes?</w:t>
+      </w:r>
+    </w:p>
+    <w:p>
+      <w:r>
+        <w:t xml:space="preserve">JSON es más ligero, consume menos ancho de banda en las peticiones HTTP y es procesado directamente como diccionarios en Python de forma más sencilla. </w:t>
+      </w:r>
+    </w:p>
+    <w:p>
+      <w:pPr>
+        <w:numPr>
+          <w:ilvl w:val="0"/>
+          <w:numId w:val="3"/>
+        </w:numPr>
+      </w:pPr>
+      <w:r>
+        <w:rPr>
+          <w:b/>
+          <w:bCs/>
+        </w:rPr>
+        <w:t>¿En qué casos se sigue utilizando XML?</w:t>
+      </w:r>
+    </w:p>
+    <w:p>
+      <w:r>
+        <w:t>Se utiliza principalmente en sistemas heredados y en protocolos de gestión de red estructurados como NETCONF, donde la validación mediante esquemas estricto (XSD) es un requisito.</w:t>
+      </w:r>
+    </w:p>
     <w:p/>
     <w:sectPr>
       <w:pgSz w:w="12240" w:h="15840"/>
@@ -310,6 +861,155 @@
 <file path=word/numbering.xml><?xml version="1.0" encoding="utf-8"?>
 <w:numbering xmlns:wpc="http://schemas.microsoft.com/office/word/2010/wordprocessingCanvas" xmlns:cx="http://schemas.microsoft.com/office/drawing/2014/chartex" xmlns:cx1="http://schemas.microsoft.com/office/drawing/2015/9/8/chartex" xmlns:cx2="http://schemas.microsoft.com/office/drawing/2015/10/21/chartex" xmlns:cx3="http://schemas.microsoft.com/office/drawing/2016/5/9/chartex" xmlns:cx4="http://schemas.microsoft.com/office/drawing/2016/5/10/chartex" xmlns:cx5="http://schemas.microsoft.com/office/drawing/2016/5/11/chartex" xmlns:cx6="http://schemas.microsoft.com/office/drawing/2016/5/12/chartex" xmlns:cx7="http://schemas.microsoft.com/office/drawing/2016/5/13/chartex" xmlns:cx8="http://schemas.microsoft.com/office/drawing/2016/5/14/chartex" xmlns:mc="http://schemas.openxmlformats.org/markup-compatibility/2006" xmlns:aink="http://schemas.microsoft.com/office/drawing/2016/ink" xmlns:am3d="http://schemas.microsoft.com/office/drawing/2017/model3d" xmlns:o="urn:schemas-microsoft-com:office:office" xmlns:oel="http://schemas.microsoft.com/office/2019/extlst" xmlns:r="http://schemas.openxmlformats.org/officeDocument/2006/relationships" xmlns:m="http://schemas.openxmlformats.org/officeDocument/2006/math" xmlns:v="urn:schemas-microsoft-com:vml" xmlns:wp14="http://schemas.microsoft.com/office/word/2010/wordprocessingDrawing" xmlns:wp="http://schemas.openxmlformats.org/drawingml/2006/wordprocessingDrawing" xmlns:w10="urn:schemas-microsoft-com:office:word" xmlns:w="http://schemas.openxmlformats.org/wordprocessingml/2006/main" xmlns:w14="http://schemas.microsoft.com/office/word/2010/wordml" xmlns:w15="http://schemas.microsoft.com/office/word/2012/wordml" xmlns:w16cex="http://schemas.microsoft.com/office/word/2018/wordml/cex" xmlns:w16cid="http://schemas.microsoft.com/office/word/2016/wordml/cid" xmlns:w16="http://schemas.microsoft.com/office/word/2018/wordml" xmlns:w16du="http://schemas.microsoft.com/office/word/2023/wordml/word16du" xmlns:w16sdtdh="http://schemas.microsoft.com/office/word/2020/wordml/sdtdatahash" xmlns:w16sdtfl="http://schemas.microsoft.com/office/word/2024/wordml/sdtformatlock" xmlns:w16se="http://schemas.microsoft.com/office/word/2015/wordml/symex" xmlns:wpg="http://schemas.microsoft.com/office/word/2010/wordprocessingGroup" xmlns:wpi="http://schemas.microsoft.com/office/word/2010/wordprocessingInk" xmlns:wne="http://schemas.microsoft.com/office/word/2006/wordml" xmlns:wps="http://schemas.microsoft.com/office/word/2010/wordprocessingShape" mc:Ignorable="w14 w15 w16se w16cid w16 w16cex w16sdtdh w16sdtfl w16du wp14">
   <w:abstractNum w:abstractNumId="0" w15:restartNumberingAfterBreak="0">
+    <w:nsid w:val="024E2474"/>
+    <w:multiLevelType w:val="multilevel"/>
+    <w:tmpl w:val="6BF2AEB8"/>
+    <w:lvl w:ilvl="0">
+      <w:start w:val="1"/>
+      <w:numFmt w:val="bullet"/>
+      <w:lvlText w:val=""/>
+      <w:lvlJc w:val="left"/>
+      <w:pPr>
+        <w:tabs>
+          <w:tab w:val="num" w:pos="720"/>
+        </w:tabs>
+        <w:ind w:left="720" w:hanging="360"/>
+      </w:pPr>
+      <w:rPr>
+        <w:rFonts w:ascii="Symbol" w:hAnsi="Symbol" w:hint="default"/>
+        <w:sz w:val="20"/>
+      </w:rPr>
+    </w:lvl>
+    <w:lvl w:ilvl="1">
+      <w:start w:val="1"/>
+      <w:numFmt w:val="bullet"/>
+      <w:lvlText w:val="o"/>
+      <w:lvlJc w:val="left"/>
+      <w:pPr>
+        <w:tabs>
+          <w:tab w:val="num" w:pos="1440"/>
+        </w:tabs>
+        <w:ind w:left="1440" w:hanging="360"/>
+      </w:pPr>
+      <w:rPr>
+        <w:rFonts w:ascii="Courier New" w:hAnsi="Courier New" w:hint="default"/>
+        <w:sz w:val="20"/>
+      </w:rPr>
+    </w:lvl>
+    <w:lvl w:ilvl="2" w:tentative="1">
+      <w:start w:val="1"/>
+      <w:numFmt w:val="bullet"/>
+      <w:lvlText w:val=""/>
+      <w:lvlJc w:val="left"/>
+      <w:pPr>
+        <w:tabs>
+          <w:tab w:val="num" w:pos="2160"/>
+        </w:tabs>
+        <w:ind w:left="2160" w:hanging="360"/>
+      </w:pPr>
+      <w:rPr>
+        <w:rFonts w:ascii="Wingdings" w:hAnsi="Wingdings" w:hint="default"/>
+        <w:sz w:val="20"/>
+      </w:rPr>
+    </w:lvl>
+    <w:lvl w:ilvl="3" w:tentative="1">
+      <w:start w:val="1"/>
+      <w:numFmt w:val="bullet"/>
+      <w:lvlText w:val=""/>
+      <w:lvlJc w:val="left"/>
+      <w:pPr>
+        <w:tabs>
+          <w:tab w:val="num" w:pos="2880"/>
+        </w:tabs>
+        <w:ind w:left="2880" w:hanging="360"/>
+      </w:pPr>
+      <w:rPr>
+        <w:rFonts w:ascii="Wingdings" w:hAnsi="Wingdings" w:hint="default"/>
+        <w:sz w:val="20"/>
+      </w:rPr>
+    </w:lvl>
+    <w:lvl w:ilvl="4" w:tentative="1">
+      <w:start w:val="1"/>
+      <w:numFmt w:val="bullet"/>
+      <w:lvlText w:val=""/>
+      <w:lvlJc w:val="left"/>
+      <w:pPr>
+        <w:tabs>
+          <w:tab w:val="num" w:pos="3600"/>
+        </w:tabs>
+        <w:ind w:left="3600" w:hanging="360"/>
+      </w:pPr>
+      <w:rPr>
+        <w:rFonts w:ascii="Wingdings" w:hAnsi="Wingdings" w:hint="default"/>
+        <w:sz w:val="20"/>
+      </w:rPr>
+    </w:lvl>
+    <w:lvl w:ilvl="5" w:tentative="1">
+      <w:start w:val="1"/>
+      <w:numFmt w:val="bullet"/>
+      <w:lvlText w:val=""/>
+      <w:lvlJc w:val="left"/>
+      <w:pPr>
+        <w:tabs>
+          <w:tab w:val="num" w:pos="4320"/>
+        </w:tabs>
+        <w:ind w:left="4320" w:hanging="360"/>
+      </w:pPr>
+      <w:rPr>
+        <w:rFonts w:ascii="Wingdings" w:hAnsi="Wingdings" w:hint="default"/>
+        <w:sz w:val="20"/>
+      </w:rPr>
+    </w:lvl>
+    <w:lvl w:ilvl="6" w:tentative="1">
+      <w:start w:val="1"/>
+      <w:numFmt w:val="bullet"/>
+      <w:lvlText w:val=""/>
+      <w:lvlJc w:val="left"/>
+      <w:pPr>
+        <w:tabs>
+          <w:tab w:val="num" w:pos="5040"/>
+        </w:tabs>
+        <w:ind w:left="5040" w:hanging="360"/>
+      </w:pPr>
+      <w:rPr>
+        <w:rFonts w:ascii="Wingdings" w:hAnsi="Wingdings" w:hint="default"/>
+        <w:sz w:val="20"/>
+      </w:rPr>
+    </w:lvl>
+    <w:lvl w:ilvl="7" w:tentative="1">
+      <w:start w:val="1"/>
+      <w:numFmt w:val="bullet"/>
+      <w:lvlText w:val=""/>
+      <w:lvlJc w:val="left"/>
+      <w:pPr>
+        <w:tabs>
+          <w:tab w:val="num" w:pos="5760"/>
+        </w:tabs>
+        <w:ind w:left="5760" w:hanging="360"/>
+      </w:pPr>
+      <w:rPr>
+        <w:rFonts w:ascii="Wingdings" w:hAnsi="Wingdings" w:hint="default"/>
+        <w:sz w:val="20"/>
+      </w:rPr>
+    </w:lvl>
+    <w:lvl w:ilvl="8" w:tentative="1">
+      <w:start w:val="1"/>
+      <w:numFmt w:val="bullet"/>
+      <w:lvlText w:val=""/>
+      <w:lvlJc w:val="left"/>
+      <w:pPr>
+        <w:tabs>
+          <w:tab w:val="num" w:pos="6480"/>
+        </w:tabs>
+        <w:ind w:left="6480" w:hanging="360"/>
+      </w:pPr>
+      <w:rPr>
+        <w:rFonts w:ascii="Wingdings" w:hAnsi="Wingdings" w:hint="default"/>
+        <w:sz w:val="20"/>
+      </w:rPr>
+    </w:lvl>
+  </w:abstractNum>
+  <w:abstractNum w:abstractNumId="1" w15:restartNumberingAfterBreak="0">
     <w:nsid w:val="39227D7D"/>
     <w:multiLevelType w:val="multilevel"/>
     <w:tmpl w:val="F68AABA8"/>
@@ -458,8 +1158,127 @@
       </w:rPr>
     </w:lvl>
   </w:abstractNum>
+  <w:abstractNum w:abstractNumId="2" w15:restartNumberingAfterBreak="0">
+    <w:nsid w:val="527945F0"/>
+    <w:multiLevelType w:val="multilevel"/>
+    <w:tmpl w:val="8850F8EC"/>
+    <w:lvl w:ilvl="0">
+      <w:start w:val="1"/>
+      <w:numFmt w:val="decimal"/>
+      <w:lvlText w:val="%1."/>
+      <w:lvlJc w:val="left"/>
+      <w:pPr>
+        <w:tabs>
+          <w:tab w:val="num" w:pos="720"/>
+        </w:tabs>
+        <w:ind w:left="720" w:hanging="360"/>
+      </w:pPr>
+    </w:lvl>
+    <w:lvl w:ilvl="1" w:tentative="1">
+      <w:start w:val="1"/>
+      <w:numFmt w:val="decimal"/>
+      <w:lvlText w:val="%2."/>
+      <w:lvlJc w:val="left"/>
+      <w:pPr>
+        <w:tabs>
+          <w:tab w:val="num" w:pos="1440"/>
+        </w:tabs>
+        <w:ind w:left="1440" w:hanging="360"/>
+      </w:pPr>
+    </w:lvl>
+    <w:lvl w:ilvl="2" w:tentative="1">
+      <w:start w:val="1"/>
+      <w:numFmt w:val="decimal"/>
+      <w:lvlText w:val="%3."/>
+      <w:lvlJc w:val="left"/>
+      <w:pPr>
+        <w:tabs>
+          <w:tab w:val="num" w:pos="2160"/>
+        </w:tabs>
+        <w:ind w:left="2160" w:hanging="360"/>
+      </w:pPr>
+    </w:lvl>
+    <w:lvl w:ilvl="3" w:tentative="1">
+      <w:start w:val="1"/>
+      <w:numFmt w:val="decimal"/>
+      <w:lvlText w:val="%4."/>
+      <w:lvlJc w:val="left"/>
+      <w:pPr>
+        <w:tabs>
+          <w:tab w:val="num" w:pos="2880"/>
+        </w:tabs>
+        <w:ind w:left="2880" w:hanging="360"/>
+      </w:pPr>
+    </w:lvl>
+    <w:lvl w:ilvl="4" w:tentative="1">
+      <w:start w:val="1"/>
+      <w:numFmt w:val="decimal"/>
+      <w:lvlText w:val="%5."/>
+      <w:lvlJc w:val="left"/>
+      <w:pPr>
+        <w:tabs>
+          <w:tab w:val="num" w:pos="3600"/>
+        </w:tabs>
+        <w:ind w:left="3600" w:hanging="360"/>
+      </w:pPr>
+    </w:lvl>
+    <w:lvl w:ilvl="5" w:tentative="1">
+      <w:start w:val="1"/>
+      <w:numFmt w:val="decimal"/>
+      <w:lvlText w:val="%6."/>
+      <w:lvlJc w:val="left"/>
+      <w:pPr>
+        <w:tabs>
+          <w:tab w:val="num" w:pos="4320"/>
+        </w:tabs>
+        <w:ind w:left="4320" w:hanging="360"/>
+      </w:pPr>
+    </w:lvl>
+    <w:lvl w:ilvl="6" w:tentative="1">
+      <w:start w:val="1"/>
+      <w:numFmt w:val="decimal"/>
+      <w:lvlText w:val="%7."/>
+      <w:lvlJc w:val="left"/>
+      <w:pPr>
+        <w:tabs>
+          <w:tab w:val="num" w:pos="5040"/>
+        </w:tabs>
+        <w:ind w:left="5040" w:hanging="360"/>
+      </w:pPr>
+    </w:lvl>
+    <w:lvl w:ilvl="7" w:tentative="1">
+      <w:start w:val="1"/>
+      <w:numFmt w:val="decimal"/>
+      <w:lvlText w:val="%8."/>
+      <w:lvlJc w:val="left"/>
+      <w:pPr>
+        <w:tabs>
+          <w:tab w:val="num" w:pos="5760"/>
+        </w:tabs>
+        <w:ind w:left="5760" w:hanging="360"/>
+      </w:pPr>
+    </w:lvl>
+    <w:lvl w:ilvl="8" w:tentative="1">
+      <w:start w:val="1"/>
+      <w:numFmt w:val="decimal"/>
+      <w:lvlText w:val="%9."/>
+      <w:lvlJc w:val="left"/>
+      <w:pPr>
+        <w:tabs>
+          <w:tab w:val="num" w:pos="6480"/>
+        </w:tabs>
+        <w:ind w:left="6480" w:hanging="360"/>
+      </w:pPr>
+    </w:lvl>
+  </w:abstractNum>
   <w:num w:numId="1" w16cid:durableId="1752698613">
+    <w:abstractNumId w:val="1"/>
+  </w:num>
+  <w:num w:numId="2" w16cid:durableId="909971762">
     <w:abstractNumId w:val="0"/>
+  </w:num>
+  <w:num w:numId="3" w16cid:durableId="285744590">
+    <w:abstractNumId w:val="2"/>
   </w:num>
 </w:numbering>
 </file>

</xml_diff>